<commit_message>
feat(florida-rc): add named operating/service-recipient affiliate to §542.335(1)(f) beneficiaries
Per operator review of Codex finding #3: add an optional employer_operating_affiliate_name
field + Cover Terms row so a known operating/service-recipient Affiliate (the entity for
whom the employee actually performs services or that holds the Protected Interests, common
in PE dedicated-employer-entity structures) can be EXPRESSLY NAMED in the Fla. Stat.
§ 542.335(1)(f) third-party-beneficiary list, alongside the 'Employer and its Affiliates'
class language — raising enforcement certainty where the operating entity is known at
drafting. Empty field prunes cleanly. validate + smoke PASS; previews/trust regenerated.
</commit_message>
<xml_diff>
--- a/content/templates/openagreements-restrictive-covenant-florida/template.docx
+++ b/content/templates/openagreements-restrictive-covenant-florida/template.docx
@@ -278,6 +278,84 @@
                 <w:sz w:val="22"/>
                 <w:szCs w:val="22"/>
               </w:rPr>
+              <w:t xml:space="preserve">{IF employer_operating_affiliate_name}Operating / Service-Recipient Affiliate</w:t>
+            </w:r>
+          </w:p>
+        </w:tc>
+        <w:tc>
+          <w:tcPr>
+            <w:tcBorders>
+              <w:top w:val="single" w:color="C7C7C7" w:sz="4"/>
+              <w:left w:val="nil" w:color="FFFFFF" w:sz="0"/>
+              <w:bottom w:val="single" w:color="C7C7C7" w:sz="4"/>
+              <w:right w:val="nil" w:color="FFFFFF" w:sz="0"/>
+            </w:tcBorders>
+            <w:tcMar>
+              <w:top w:type="dxa" w:w="80"/>
+              <w:left w:type="dxa" w:w="115"/>
+              <w:bottom w:type="dxa" w:w="80"/>
+              <w:right w:type="dxa" w:w="115"/>
+            </w:tcMar>
+            <w:vAlign w:val="center"/>
+          </w:tcPr>
+          <w:p>
+            <w:pPr>
+              <w:pStyle w:val="Normal"/>
+              <w:spacing w:after="0" w:before="0" w:line="340" w:beforeAutospacing="false" w:afterAutospacing="false"/>
+              <w:contextualSpacing w:val="false"/>
+            </w:pPr>
+            <w:r>
+              <w:rPr>
+                <w:rFonts w:ascii="Arial" w:cs="Arial" w:eastAsia="Arial" w:hAnsi="Arial"/>
+                <w:b w:val="false"/>
+                <w:bCs w:val="false"/>
+                <w:i w:val="false"/>
+                <w:iCs w:val="false"/>
+                <w:color w:val="1D2021"/>
+                <w:sz w:val="22"/>
+                <w:szCs w:val="22"/>
+              </w:rPr>
+              <w:t xml:space="preserve">{employer_operating_affiliate_name}{END-IF}</w:t>
+            </w:r>
+          </w:p>
+        </w:tc>
+      </w:tr>
+      <w:tr>
+        <w:trPr>
+          <w:trHeight w:val="317" w:hRule="atLeast"/>
+        </w:trPr>
+        <w:tc>
+          <w:tcPr>
+            <w:tcBorders>
+              <w:top w:val="single" w:color="C7C7C7" w:sz="4"/>
+              <w:left w:val="nil" w:color="FFFFFF" w:sz="0"/>
+              <w:bottom w:val="single" w:color="C7C7C7" w:sz="4"/>
+              <w:right w:val="nil" w:color="FFFFFF" w:sz="0"/>
+            </w:tcBorders>
+            <w:tcMar>
+              <w:top w:type="dxa" w:w="80"/>
+              <w:left w:type="dxa" w:w="115"/>
+              <w:bottom w:type="dxa" w:w="80"/>
+              <w:right w:type="dxa" w:w="115"/>
+            </w:tcMar>
+            <w:vAlign w:val="center"/>
+          </w:tcPr>
+          <w:p>
+            <w:pPr>
+              <w:pStyle w:val="Normal"/>
+              <w:spacing w:after="0" w:before="0" w:line="340"/>
+            </w:pPr>
+            <w:r>
+              <w:rPr>
+                <w:rFonts w:ascii="Arial" w:cs="Arial" w:eastAsia="Arial" w:hAnsi="Arial"/>
+                <w:b/>
+                <w:bCs/>
+                <w:i w:val="false"/>
+                <w:iCs w:val="false"/>
+                <w:color w:val="1D2021"/>
+                <w:sz w:val="22"/>
+                <w:szCs w:val="22"/>
+              </w:rPr>
               <w:t xml:space="preserve">Employee</w:t>
             </w:r>
           </w:p>
@@ -4423,7 +4501,7 @@
           <w:sz w:val="22"/>
           <w:szCs w:val="22"/>
         </w:rPr>
-        <w:t xml:space="preserve">Employee may not assign this agreement or any rights or obligations under it. Employer may assign this agreement, and the restrictive covenants in it, to Employer's direct corporate parent (identified in Cover Terms under Employer Parent Entity, if any), to any of Employer's Affiliates, or to any successor or acquirer of all or substantially all of Employer's business or assets. Pursuant to Fla. Stat. § 542.335(1)(f), Employer expressly authorizes enforcement of the restrictive covenants in this agreement by Employer's assignee or successor. The parties further expressly identify, as third-party beneficiaries of this agreement entitled to enforce the restrictive covenants for their own benefit, each of the following: Employer's direct corporate parent (as identified in Cover Terms, if any); Employer's Affiliates, including any operating company or commonly controlled entity on whose behalf Employee performs services or that holds any of the Protected Interests; and any successor or assignee of Employer. The parties expressly state that the restrictive covenants are intended for the benefit of each such expressly-identified person, as required by Fla. Stat. § 542.335(1)(f)1. This agreement is binding on and inures to the benefit of the parties and their respective heirs, successors, third-party beneficiaries, and permitted assigns.</w:t>
+        <w:t xml:space="preserve">Employee may not assign this agreement or any rights or obligations under it. Employer may assign this agreement, and the restrictive covenants in it, to Employer's direct corporate parent (identified in Cover Terms under Employer Parent Entity, if any), to any of Employer's Affiliates, or to any successor or acquirer of all or substantially all of Employer's business or assets. Pursuant to Fla. Stat. § 542.335(1)(f), Employer expressly authorizes enforcement of the restrictive covenants in this agreement by Employer's assignee or successor. The parties further expressly identify, as third-party beneficiaries of this agreement entitled to enforce the restrictive covenants for their own benefit, each of the following: Employer's direct corporate parent (as identified in Cover Terms, if any); the operating or service-recipient Affiliate identified in Cover Terms (if any) on whose behalf Employee performs services or that holds any of the Protected Interests; Employer's Affiliates, including any operating company or commonly controlled entity on whose behalf Employee performs services or that holds any of the Protected Interests; and any successor or assignee of Employer. The parties expressly state that the restrictive covenants are intended for the benefit of each such expressly-identified person, as required by Fla. Stat. § 542.335(1)(f)1. This agreement is binding on and inures to the benefit of the parties and their respective heirs, successors, third-party beneficiaries, and permitted assigns.</w:t>
       </w:r>
     </w:p>
     <w:p>

</xml_diff>

<commit_message>
feat(renderer): simplify cover confirmation notice copy (section refs now link)
Now that each item's 'Section N' is a clickable internal jump (#416/#426), the
notice no longer needs the 'find the named section' hand-scan instruction, the
'this list is only an index' framing, or the '(see the named section...)'
parenthetical. Trimmed to: confirm the stated fact, delete the in-body yellow
bracket, delete the notice. Hyperlinks unchanged; the 'CONFIRM before signing'
phrase stays verbatim (no leading bracket/colon) so it can't spoof the in-body
statutory-compliance validator.

The banner renders in the catalog preview (positive {IF any_confirmation_pending}
block), so Florida's preview PNGs are regenerated and its now-obsolete
byte-identical manifest entry is removed.
</commit_message>
<xml_diff>
--- a/content/templates/openagreements-restrictive-covenant-florida/template.docx
+++ b/content/templates/openagreements-restrictive-covenant-florida/template.docx
@@ -67,7 +67,7 @@
           <w:highlight w:val="yellow"/>
           <w:highlightCs w:val="yellow"/>
         </w:rPr>
-        <w:t xml:space="preserve">This page lists statutory-compliance items a person must verify before signing. Each appears in full within the Standard Terms below, flagged there with a yellow "CONFIRM before signing" bracket. This list is only an index: for each item, find the named section in the Standard Terms, confirm the stated fact occurred, and delete the yellow bracket there. Delete this entire notice before signing.</w:t>
+        <w:t xml:space="preserve">For each item below, confirm the stated fact occurred, then delete its yellow "CONFIRM before signing" bracket in the Standard Terms. Delete this notice before signing.</w:t>
       </w:r>
     </w:p>
     <w:p>
@@ -87,7 +87,7 @@
           <w:highlight w:val="yellow"/>
           <w:highlightCs w:val="yellow"/>
         </w:rPr>
-        <w:t xml:space="preserve">Items requiring confirmation (see the named section of the Standard Terms):</w:t>
+        <w:t xml:space="preserve">Items requiring confirmation:</w:t>
       </w:r>
     </w:p>
     <w:p>
@@ -158,7 +158,7 @@
         </w:rPr>
         <w:t xml:space="preserve"> — CHOICE Act Counsel Advisal and Notice (Covered Employee) — for more details see </w:t>
       </w:r>
-      <w:hyperlink w:history="1" r:id="rId8w9wrk8qgbbrkwtenvh1i">
+      <w:hyperlink w:history="1" r:id="rIdyardizhziyaop2q0ql7p3">
         <w:r>
           <w:rPr>
             <w:rFonts w:ascii="Arial" w:cs="Arial" w:eastAsia="Arial" w:hAnsi="Arial"/>

</xml_diff>

<commit_message>
feat(renderer): simplify cover confirmation notice copy (section refs now link) (#427)
Now that each item's 'Section N' is a clickable internal jump (#416/#426), the
notice no longer needs the 'find the named section' hand-scan instruction, the
'this list is only an index' framing, or the '(see the named section...)'
parenthetical. Trimmed to: confirm the stated fact, delete the in-body yellow
bracket, delete the notice. Hyperlinks unchanged; the 'CONFIRM before signing'
phrase stays verbatim (no leading bracket/colon) so it can't spoof the in-body
statutory-compliance validator.

The banner renders in the catalog preview (positive {IF any_confirmation_pending}
block), so Florida's preview PNGs are regenerated and its now-obsolete
byte-identical manifest entry is removed.
</commit_message>
<xml_diff>
--- a/content/templates/openagreements-restrictive-covenant-florida/template.docx
+++ b/content/templates/openagreements-restrictive-covenant-florida/template.docx
@@ -67,7 +67,7 @@
           <w:highlight w:val="yellow"/>
           <w:highlightCs w:val="yellow"/>
         </w:rPr>
-        <w:t xml:space="preserve">This page lists statutory-compliance items a person must verify before signing. Each appears in full within the Standard Terms below, flagged there with a yellow "CONFIRM before signing" bracket. This list is only an index: for each item, find the named section in the Standard Terms, confirm the stated fact occurred, and delete the yellow bracket there. Delete this entire notice before signing.</w:t>
+        <w:t xml:space="preserve">For each item below, confirm the stated fact occurred, then delete its yellow "CONFIRM before signing" bracket in the Standard Terms. Delete this notice before signing.</w:t>
       </w:r>
     </w:p>
     <w:p>
@@ -87,7 +87,7 @@
           <w:highlight w:val="yellow"/>
           <w:highlightCs w:val="yellow"/>
         </w:rPr>
-        <w:t xml:space="preserve">Items requiring confirmation (see the named section of the Standard Terms):</w:t>
+        <w:t xml:space="preserve">Items requiring confirmation:</w:t>
       </w:r>
     </w:p>
     <w:p>
@@ -158,7 +158,7 @@
         </w:rPr>
         <w:t xml:space="preserve"> — CHOICE Act Counsel Advisal and Notice (Covered Employee) — for more details see </w:t>
       </w:r>
-      <w:hyperlink w:history="1" r:id="rId8w9wrk8qgbbrkwtenvh1i">
+      <w:hyperlink w:history="1" r:id="rIdyardizhziyaop2q0ql7p3">
         <w:r>
           <w:rPr>
             <w:rFonts w:ascii="Arial" w:cs="Arial" w:eastAsia="Arial" w:hAnsi="Arial"/>

</xml_diff>

<commit_message>
feat(renderer): singular/plural cover-notice copy by confirm-clause count
When a template has exactly one confirm clause (today: Florida), the page-one
confirmation notice now reads 'For the item below…' / 'Item requiring
confirmation:'; with 2+ it keeps the plural wording. Based on the static
confirmClauses.length. 'CONFIRM before signing' stays verbatim (no leading
bracket/colon) so it can't spoof the in-body checkStatutoryComplianceReps
validator. Florida template.docx + page-01 preview regenerated.

Implemented by Codex; peer review (Gemini + Codex) pending.

Follow-up to #426/#427.
</commit_message>
<xml_diff>
--- a/content/templates/openagreements-restrictive-covenant-florida/template.docx
+++ b/content/templates/openagreements-restrictive-covenant-florida/template.docx
@@ -67,7 +67,7 @@
           <w:highlight w:val="yellow"/>
           <w:highlightCs w:val="yellow"/>
         </w:rPr>
-        <w:t xml:space="preserve">For each item below, confirm the stated fact occurred, then delete its yellow "CONFIRM before signing" bracket in the Standard Terms. Delete this notice before signing.</w:t>
+        <w:t xml:space="preserve">For the item below, confirm the stated fact occurred, then delete its yellow "CONFIRM before signing" bracket in the Standard Terms. Delete this notice before signing.</w:t>
       </w:r>
     </w:p>
     <w:p>
@@ -87,7 +87,7 @@
           <w:highlight w:val="yellow"/>
           <w:highlightCs w:val="yellow"/>
         </w:rPr>
-        <w:t xml:space="preserve">Items requiring confirmation:</w:t>
+        <w:t xml:space="preserve">Item requiring confirmation:</w:t>
       </w:r>
     </w:p>
     <w:p>
@@ -158,7 +158,7 @@
         </w:rPr>
         <w:t xml:space="preserve"> — CHOICE Act Counsel Advisal and Notice (Covered Employee) — for more details see </w:t>
       </w:r>
-      <w:hyperlink w:history="1" r:id="rIdyardizhziyaop2q0ql7p3">
+      <w:hyperlink w:history="1" r:id="rIdithnsafh1mw68165ygoji">
         <w:r>
           <w:rPr>
             <w:rFonts w:ascii="Arial" w:cs="Arial" w:eastAsia="Arial" w:hAnsi="Arial"/>

</xml_diff>

<commit_message>
feat(renderer): singular/plural cover-notice copy by confirm-clause count (#429)
* feat(renderer): singular/plural cover-notice copy by confirm-clause count

When a template has exactly one confirm clause (today: Florida), the page-one
confirmation notice now reads 'For the item below…' / 'Item requiring
confirmation:'; with 2+ it keeps the plural wording. Based on the static
confirmClauses.length. 'CONFIRM before signing' stays verbatim (no leading
bracket/colon) so it can't spoof the in-body checkStatutoryComplianceReps
validator. Florida template.docx + page-01 preview regenerated.

Implemented by Codex; peer review (Gemini + Codex) pending.

Follow-up to #426/#427.

* test(cover-notice): also assert plural instruction sentence is absent

Per Codex peer review: harden the singular-copy assertion so a regression that
leaves BOTH instruction variants present is caught, not just a leaked plural label.
</commit_message>
<xml_diff>
--- a/content/templates/openagreements-restrictive-covenant-florida/template.docx
+++ b/content/templates/openagreements-restrictive-covenant-florida/template.docx
@@ -67,7 +67,7 @@
           <w:highlight w:val="yellow"/>
           <w:highlightCs w:val="yellow"/>
         </w:rPr>
-        <w:t xml:space="preserve">For each item below, confirm the stated fact occurred, then delete its yellow "CONFIRM before signing" bracket in the Standard Terms. Delete this notice before signing.</w:t>
+        <w:t xml:space="preserve">For the item below, confirm the stated fact occurred, then delete its yellow "CONFIRM before signing" bracket in the Standard Terms. Delete this notice before signing.</w:t>
       </w:r>
     </w:p>
     <w:p>
@@ -87,7 +87,7 @@
           <w:highlight w:val="yellow"/>
           <w:highlightCs w:val="yellow"/>
         </w:rPr>
-        <w:t xml:space="preserve">Items requiring confirmation:</w:t>
+        <w:t xml:space="preserve">Item requiring confirmation:</w:t>
       </w:r>
     </w:p>
     <w:p>
@@ -158,7 +158,7 @@
         </w:rPr>
         <w:t xml:space="preserve"> — CHOICE Act Counsel Advisal and Notice (Covered Employee) — for more details see </w:t>
       </w:r>
-      <w:hyperlink w:history="1" r:id="rIdyardizhziyaop2q0ql7p3">
+      <w:hyperlink w:history="1" r:id="rIdithnsafh1mw68165ygoji">
         <w:r>
           <w:rPr>
             <w:rFonts w:ascii="Arial" w:cs="Arial" w:eastAsia="Arial" w:hAnsi="Arial"/>

</xml_diff>